<commit_message>
Center Study 4 on UK links with India and China
Co-authored-by: yuxuan980925 <yuxuan980925@users.noreply.github.com>
</commit_message>
<xml_diff>
--- a/Study4_Article_Complete/FIGURES.docx
+++ b/Study4_Article_Complete/FIGURES.docx
@@ -10,13 +10,13 @@
         <w:t xml:space="preserve">FIGURES</w:t>
       </w:r>
     </w:p>
-    <w:bookmarkStart w:id="104" w:name="figures-121"/>
+    <w:bookmarkStart w:id="112" w:name="supplementary-figures-123"/>
     <w:p>
       <w:pPr>
         <w:pStyle w:val="Heading1"/>
       </w:pPr>
       <w:r>
-        <w:t xml:space="preserve">Figures 1–21</w:t>
+        <w:t xml:space="preserve">Supplementary figures 1–23</w:t>
       </w:r>
     </w:p>
     <w:p>
@@ -34,7 +34,7 @@
           <w:iCs/>
           <w:i/>
         </w:rPr>
-        <w:t xml:space="preserve">How Does the Civil Engineering Industry Economy Change under an AI Shock?</w:t>
+        <w:t xml:space="preserve">How Does the Civil Engineering Industry Economy Change under an AI Shock? The United Kingdom’s Service Links with India and China</w:t>
       </w:r>
     </w:p>
     <w:bookmarkStart w:id="23" w:name="figure-1"/>
@@ -1402,7 +1402,137 @@
       </w:r>
     </w:p>
     <w:bookmarkEnd w:id="103"/>
-    <w:bookmarkEnd w:id="104"/>
+    <w:bookmarkStart w:id="107" w:name="figure-22"/>
+    <w:p>
+      <w:pPr>
+        <w:pStyle w:val="Heading2"/>
+      </w:pPr>
+      <w:r>
+        <w:t xml:space="preserve">Figure 22</w:t>
+      </w:r>
+    </w:p>
+    <w:p>
+      <w:pPr>
+        <w:pStyle w:val="FirstParagraph"/>
+      </w:pPr>
+      <w:r>
+        <w:t xml:space="preserve">UK–India and UK–China SJ3 corridors, 2019 = 100.</w:t>
+      </w:r>
+    </w:p>
+    <w:p>
+      <w:pPr>
+        <w:pStyle w:val="BodyText"/>
+      </w:pPr>
+      <w:r>
+        <w:drawing>
+          <wp:inline>
+            <wp:extent cx="5334000" cy="3188804"/>
+            <wp:effectExtent b="0" l="0" r="0" t="0"/>
+            <wp:docPr descr="Figure 22" title="" id="105" name="Picture"/>
+            <a:graphic>
+              <a:graphicData uri="http://schemas.openxmlformats.org/drawingml/2006/picture">
+                <pic:pic>
+                  <pic:nvPicPr>
+                    <pic:cNvPr descr="figures/figure22_uk_india_china_sj3.png" id="106" name="Picture"/>
+                    <pic:cNvPicPr>
+                      <a:picLocks noChangeArrowheads="1" noChangeAspect="1"/>
+                    </pic:cNvPicPr>
+                  </pic:nvPicPr>
+                  <pic:blipFill>
+                    <a:blip r:embed="rId104"/>
+                    <a:stretch>
+                      <a:fillRect/>
+                    </a:stretch>
+                  </pic:blipFill>
+                  <pic:spPr bwMode="auto">
+                    <a:xfrm>
+                      <a:off x="0" y="0"/>
+                      <a:ext cx="5334000" cy="3188804"/>
+                    </a:xfrm>
+                    <a:prstGeom prst="rect">
+                      <a:avLst/>
+                    </a:prstGeom>
+                    <a:noFill/>
+                    <a:ln w="9525">
+                      <a:noFill/>
+                      <a:headEnd/>
+                      <a:tailEnd/>
+                    </a:ln>
+                  </pic:spPr>
+                </pic:pic>
+              </a:graphicData>
+            </a:graphic>
+          </wp:inline>
+        </w:drawing>
+      </w:r>
+    </w:p>
+    <w:bookmarkEnd w:id="107"/>
+    <w:bookmarkStart w:id="111" w:name="figure-23"/>
+    <w:p>
+      <w:pPr>
+        <w:pStyle w:val="Heading2"/>
+      </w:pPr>
+      <w:r>
+        <w:t xml:space="preserve">Figure 23</w:t>
+      </w:r>
+    </w:p>
+    <w:p>
+      <w:pPr>
+        <w:pStyle w:val="FirstParagraph"/>
+      </w:pPr>
+      <w:r>
+        <w:t xml:space="preserve">UK–India and UK–China service growth by category.</w:t>
+      </w:r>
+    </w:p>
+    <w:p>
+      <w:pPr>
+        <w:pStyle w:val="BodyText"/>
+      </w:pPr>
+      <w:r>
+        <w:drawing>
+          <wp:inline>
+            <wp:extent cx="5334000" cy="2133600"/>
+            <wp:effectExtent b="0" l="0" r="0" t="0"/>
+            <wp:docPr descr="Figure 23" title="" id="109" name="Picture"/>
+            <a:graphic>
+              <a:graphicData uri="http://schemas.openxmlformats.org/drawingml/2006/picture">
+                <pic:pic>
+                  <pic:nvPicPr>
+                    <pic:cNvPr descr="figures/figure23_uk_india_china_service_growth.png" id="110" name="Picture"/>
+                    <pic:cNvPicPr>
+                      <a:picLocks noChangeArrowheads="1" noChangeAspect="1"/>
+                    </pic:cNvPicPr>
+                  </pic:nvPicPr>
+                  <pic:blipFill>
+                    <a:blip r:embed="rId108"/>
+                    <a:stretch>
+                      <a:fillRect/>
+                    </a:stretch>
+                  </pic:blipFill>
+                  <pic:spPr bwMode="auto">
+                    <a:xfrm>
+                      <a:off x="0" y="0"/>
+                      <a:ext cx="5334000" cy="2133600"/>
+                    </a:xfrm>
+                    <a:prstGeom prst="rect">
+                      <a:avLst/>
+                    </a:prstGeom>
+                    <a:noFill/>
+                    <a:ln w="9525">
+                      <a:noFill/>
+                      <a:headEnd/>
+                      <a:tailEnd/>
+                    </a:ln>
+                  </pic:spPr>
+                </pic:pic>
+              </a:graphicData>
+            </a:graphic>
+          </wp:inline>
+        </w:drawing>
+      </w:r>
+    </w:p>
+    <w:bookmarkEnd w:id="111"/>
+    <w:bookmarkEnd w:id="112"/>
     <w:sectPr/>
   </w:body>
 </w:document>

</xml_diff>